<commit_message>
chore: atualiza submodules com escalonamento N1/N2/N3, WhatsApp, SLA e dashboard
- chamado-pro-backend: escalonamento manual/automático (SLA), integração WhatsApp via CallMeBot, gestão de SLA, dashboard admin, histórico de chamados
- chamado-pro-frontend: telas de notificações, dashboard admin, configuração de SLA e ajustes de roteamento/proxy
- Atualiza guia de implantação
- Ignora pasta de backup local do backend
</commit_message>
<xml_diff>
--- a/CHP/5.Implantação/CHP - Guia de Implantação.docx
+++ b/CHP/5.Implantação/CHP - Guia de Implantação.docx
@@ -4317,7 +4317,10 @@
         <w:ind w:left="708"/>
       </w:pPr>
       <w:r>
-        <w:t>- Tipo: db.t3.micro</w:t>
+        <w:t>- Tipo: db.t3.</w:t>
+      </w:r>
+      <w:r>
+        <w:t>small</w:t>
       </w:r>
     </w:p>
     <w:p>
@@ -4447,13 +4450,12 @@
         </w:rPr>
         <w:t>17</w:t>
       </w:r>
-    </w:p>
-    <w:p>
-      <w:pPr>
+      <w:r>
         <w:rPr>
           <w:lang w:val="pt-PT" w:eastAsia="en-US"/>
         </w:rPr>
-      </w:pPr>
+        <w:t xml:space="preserve"> (RDS)</w:t>
+      </w:r>
     </w:p>
     <w:p>
       <w:pPr>
@@ -4461,10 +4463,17 @@
           <w:lang w:val="pt-PT" w:eastAsia="en-US"/>
         </w:rPr>
       </w:pPr>
-      <w:r>
+    </w:p>
+    <w:p>
+      <w:pPr>
         <w:rPr>
           <w:lang w:val="pt-PT" w:eastAsia="en-US"/>
         </w:rPr>
+      </w:pPr>
+      <w:r>
+        <w:rPr>
+          <w:lang w:val="pt-PT" w:eastAsia="en-US"/>
+        </w:rPr>
         <w:t>Frontend</w:t>
       </w:r>
     </w:p>
@@ -4512,41 +4521,22 @@
     </w:p>
     <w:p>
       <w:pPr>
-        <w:ind w:left="708"/>
         <w:rPr>
           <w:lang w:val="pt-PT" w:eastAsia="en-US"/>
         </w:rPr>
       </w:pPr>
-      <w:r>
+    </w:p>
+    <w:p>
+      <w:pPr>
         <w:rPr>
           <w:lang w:val="pt-PT" w:eastAsia="en-US"/>
         </w:rPr>
-        <w:t xml:space="preserve">- </w:t>
-      </w:r>
+      </w:pPr>
       <w:r>
         <w:rPr>
           <w:lang w:val="pt-PT" w:eastAsia="en-US"/>
         </w:rPr>
-        <w:t>NGINX (em caso de deploy via container)</w:t>
-      </w:r>
-    </w:p>
-    <w:p>
-      <w:pPr>
-        <w:rPr>
-          <w:lang w:val="pt-PT" w:eastAsia="en-US"/>
-        </w:rPr>
-      </w:pPr>
-    </w:p>
-    <w:p>
-      <w:pPr>
-        <w:rPr>
-          <w:lang w:val="pt-PT" w:eastAsia="en-US"/>
-        </w:rPr>
-      </w:pPr>
-      <w:r>
-        <w:rPr>
-          <w:lang w:val="pt-PT" w:eastAsia="en-US"/>
-        </w:rPr>
+        <w:lastRenderedPageBreak/>
         <w:t>DevOps / Infraestrutura</w:t>
       </w:r>
     </w:p>
@@ -4916,21 +4906,21 @@
         <w:rPr>
           <w:lang w:val="en-US"/>
         </w:rPr>
-        <w:t xml:space="preserve">- </w:t>
-      </w:r>
-      <w:proofErr w:type="spellStart"/>
-      <w:r>
+        <w:t>- sudo yum update -y</w:t>
+      </w:r>
+    </w:p>
+    <w:p>
+      <w:pPr>
+        <w:ind w:left="1416"/>
         <w:rPr>
           <w:lang w:val="en-US"/>
         </w:rPr>
-        <w:t>sudo</w:t>
-      </w:r>
-      <w:proofErr w:type="spellEnd"/>
+      </w:pPr>
       <w:r>
         <w:rPr>
           <w:lang w:val="en-US"/>
         </w:rPr>
-        <w:t xml:space="preserve"> yum update -y</w:t>
+        <w:t>- sudo yum install git -y</w:t>
       </w:r>
     </w:p>
     <w:p>
@@ -4944,21 +4934,21 @@
         <w:rPr>
           <w:lang w:val="en-US"/>
         </w:rPr>
-        <w:t xml:space="preserve">- </w:t>
-      </w:r>
-      <w:proofErr w:type="spellStart"/>
-      <w:r>
+        <w:t>- sudo yum install docker -y</w:t>
+      </w:r>
+    </w:p>
+    <w:p>
+      <w:pPr>
+        <w:ind w:left="1416"/>
         <w:rPr>
           <w:lang w:val="en-US"/>
         </w:rPr>
-        <w:t>sudo</w:t>
-      </w:r>
-      <w:proofErr w:type="spellEnd"/>
+      </w:pPr>
       <w:r>
         <w:rPr>
           <w:lang w:val="en-US"/>
         </w:rPr>
-        <w:t xml:space="preserve"> yum install git -y</w:t>
+        <w:t>- sudo systemctl enable docker</w:t>
       </w:r>
     </w:p>
     <w:p>
@@ -4972,21 +4962,21 @@
         <w:rPr>
           <w:lang w:val="en-US"/>
         </w:rPr>
-        <w:t xml:space="preserve">- </w:t>
-      </w:r>
-      <w:proofErr w:type="spellStart"/>
-      <w:r>
+        <w:t>- sudo systemctl start docker</w:t>
+      </w:r>
+    </w:p>
+    <w:p>
+      <w:pPr>
+        <w:ind w:left="1416"/>
         <w:rPr>
           <w:lang w:val="en-US"/>
         </w:rPr>
-        <w:t>sudo</w:t>
-      </w:r>
-      <w:proofErr w:type="spellEnd"/>
+      </w:pPr>
       <w:r>
         <w:rPr>
           <w:lang w:val="en-US"/>
         </w:rPr>
-        <w:t xml:space="preserve"> yum install docker -y</w:t>
+        <w:t>- sudo usermod -aG docker ec2-user</w:t>
       </w:r>
     </w:p>
     <w:p>
@@ -4996,44 +4986,49 @@
           <w:lang w:val="en-US"/>
         </w:rPr>
       </w:pPr>
-      <w:r>
+    </w:p>
+    <w:p>
+      <w:pPr>
+        <w:ind w:left="1416"/>
         <w:rPr>
           <w:lang w:val="en-US"/>
         </w:rPr>
-        <w:t xml:space="preserve">- </w:t>
-      </w:r>
-      <w:proofErr w:type="spellStart"/>
+      </w:pPr>
       <w:r>
         <w:rPr>
           <w:lang w:val="en-US"/>
         </w:rPr>
-        <w:t>sudo</w:t>
-      </w:r>
-      <w:proofErr w:type="spellEnd"/>
-      <w:r>
+        <w:t>- sudo curl -L "https://github.com/docker/compose/releases/download/v2.24.0/docker-compose-$(uname -s)-$(uname -m)" -o /usr/local/bin/docker-compose</w:t>
+      </w:r>
+    </w:p>
+    <w:p>
+      <w:pPr>
+        <w:ind w:left="1416"/>
         <w:rPr>
           <w:lang w:val="en-US"/>
         </w:rPr>
-        <w:t xml:space="preserve"> </w:t>
-      </w:r>
-      <w:proofErr w:type="spellStart"/>
+      </w:pPr>
       <w:r>
         <w:rPr>
           <w:lang w:val="en-US"/>
         </w:rPr>
-        <w:t>systemctl</w:t>
-      </w:r>
-      <w:proofErr w:type="spellEnd"/>
+        <w:t>- sudo chmod +x /usr/local/bin/docker-compose</w:t>
+      </w:r>
+    </w:p>
+    <w:p>
       <w:r>
         <w:rPr>
           <w:lang w:val="en-US"/>
         </w:rPr>
-        <w:t xml:space="preserve"> enable docker</w:t>
-      </w:r>
-    </w:p>
-    <w:p>
-      <w:pPr>
-        <w:ind w:left="1416"/>
+        <w:tab/>
+      </w:r>
+      <w:r>
+        <w:t>- Clonar projeto dentro da instância:</w:t>
+      </w:r>
+    </w:p>
+    <w:p>
+      <w:pPr>
+        <w:ind w:left="708" w:firstLine="708"/>
         <w:rPr>
           <w:lang w:val="en-US"/>
         </w:rPr>
@@ -5042,250 +5037,7 @@
         <w:rPr>
           <w:lang w:val="en-US"/>
         </w:rPr>
-        <w:t xml:space="preserve">- </w:t>
-      </w:r>
-      <w:proofErr w:type="spellStart"/>
-      <w:r>
-        <w:rPr>
-          <w:lang w:val="en-US"/>
-        </w:rPr>
-        <w:t>sudo</w:t>
-      </w:r>
-      <w:proofErr w:type="spellEnd"/>
-      <w:r>
-        <w:rPr>
-          <w:lang w:val="en-US"/>
-        </w:rPr>
-        <w:t xml:space="preserve"> </w:t>
-      </w:r>
-      <w:proofErr w:type="spellStart"/>
-      <w:r>
-        <w:rPr>
-          <w:lang w:val="en-US"/>
-        </w:rPr>
-        <w:t>systemctl</w:t>
-      </w:r>
-      <w:proofErr w:type="spellEnd"/>
-      <w:r>
-        <w:rPr>
-          <w:lang w:val="en-US"/>
-        </w:rPr>
-        <w:t xml:space="preserve"> start docker</w:t>
-      </w:r>
-    </w:p>
-    <w:p>
-      <w:pPr>
-        <w:ind w:left="1416"/>
-        <w:rPr>
-          <w:lang w:val="en-US"/>
-        </w:rPr>
-      </w:pPr>
-      <w:r>
-        <w:rPr>
-          <w:lang w:val="en-US"/>
-        </w:rPr>
-        <w:t xml:space="preserve">- </w:t>
-      </w:r>
-      <w:proofErr w:type="spellStart"/>
-      <w:r>
-        <w:rPr>
-          <w:lang w:val="en-US"/>
-        </w:rPr>
-        <w:t>sudo</w:t>
-      </w:r>
-      <w:proofErr w:type="spellEnd"/>
-      <w:r>
-        <w:rPr>
-          <w:lang w:val="en-US"/>
-        </w:rPr>
-        <w:t xml:space="preserve"> </w:t>
-      </w:r>
-      <w:proofErr w:type="spellStart"/>
-      <w:r>
-        <w:rPr>
-          <w:lang w:val="en-US"/>
-        </w:rPr>
-        <w:t>usermod</w:t>
-      </w:r>
-      <w:proofErr w:type="spellEnd"/>
-      <w:r>
-        <w:rPr>
-          <w:lang w:val="en-US"/>
-        </w:rPr>
-        <w:t xml:space="preserve"> -</w:t>
-      </w:r>
-      <w:proofErr w:type="spellStart"/>
-      <w:r>
-        <w:rPr>
-          <w:lang w:val="en-US"/>
-        </w:rPr>
-        <w:t>aG</w:t>
-      </w:r>
-      <w:proofErr w:type="spellEnd"/>
-      <w:r>
-        <w:rPr>
-          <w:lang w:val="en-US"/>
-        </w:rPr>
-        <w:t xml:space="preserve"> docker ec2-user</w:t>
-      </w:r>
-    </w:p>
-    <w:p>
-      <w:pPr>
-        <w:ind w:left="1416"/>
-        <w:rPr>
-          <w:lang w:val="en-US"/>
-        </w:rPr>
-      </w:pPr>
-    </w:p>
-    <w:p>
-      <w:pPr>
-        <w:ind w:left="1416"/>
-        <w:rPr>
-          <w:lang w:val="en-US"/>
-        </w:rPr>
-      </w:pPr>
-      <w:r>
-        <w:rPr>
-          <w:lang w:val="en-US"/>
-        </w:rPr>
-        <w:t xml:space="preserve">- </w:t>
-      </w:r>
-      <w:proofErr w:type="spellStart"/>
-      <w:r>
-        <w:rPr>
-          <w:lang w:val="en-US"/>
-        </w:rPr>
-        <w:t>sudo</w:t>
-      </w:r>
-      <w:proofErr w:type="spellEnd"/>
-      <w:r>
-        <w:rPr>
-          <w:lang w:val="en-US"/>
-        </w:rPr>
-        <w:t xml:space="preserve"> curl -L "https://github.com/docker/compose/releases/download/v2.24.0/docker-compose-$(uname -s)-$(</w:t>
-      </w:r>
-      <w:proofErr w:type="spellStart"/>
-      <w:r>
-        <w:rPr>
-          <w:lang w:val="en-US"/>
-        </w:rPr>
-        <w:t>uname</w:t>
-      </w:r>
-      <w:proofErr w:type="spellEnd"/>
-      <w:r>
-        <w:rPr>
-          <w:lang w:val="en-US"/>
-        </w:rPr>
-        <w:t xml:space="preserve"> -m)" -o /</w:t>
-      </w:r>
-      <w:proofErr w:type="spellStart"/>
-      <w:r>
-        <w:rPr>
-          <w:lang w:val="en-US"/>
-        </w:rPr>
-        <w:t>usr</w:t>
-      </w:r>
-      <w:proofErr w:type="spellEnd"/>
-      <w:r>
-        <w:rPr>
-          <w:lang w:val="en-US"/>
-        </w:rPr>
-        <w:t>/local/bin/docker-compose</w:t>
-      </w:r>
-    </w:p>
-    <w:p>
-      <w:pPr>
-        <w:ind w:left="1416"/>
-        <w:rPr>
-          <w:lang w:val="en-US"/>
-        </w:rPr>
-      </w:pPr>
-      <w:r>
-        <w:rPr>
-          <w:lang w:val="en-US"/>
-        </w:rPr>
-        <w:t xml:space="preserve">- </w:t>
-      </w:r>
-      <w:proofErr w:type="spellStart"/>
-      <w:r>
-        <w:rPr>
-          <w:lang w:val="en-US"/>
-        </w:rPr>
-        <w:t>sudo</w:t>
-      </w:r>
-      <w:proofErr w:type="spellEnd"/>
-      <w:r>
-        <w:rPr>
-          <w:lang w:val="en-US"/>
-        </w:rPr>
-        <w:t xml:space="preserve"> </w:t>
-      </w:r>
-      <w:proofErr w:type="spellStart"/>
-      <w:r>
-        <w:rPr>
-          <w:lang w:val="en-US"/>
-        </w:rPr>
-        <w:t>chmod</w:t>
-      </w:r>
-      <w:proofErr w:type="spellEnd"/>
-      <w:r>
-        <w:rPr>
-          <w:lang w:val="en-US"/>
-        </w:rPr>
-        <w:t xml:space="preserve"> +x /</w:t>
-      </w:r>
-      <w:proofErr w:type="spellStart"/>
-      <w:r>
-        <w:rPr>
-          <w:lang w:val="en-US"/>
-        </w:rPr>
-        <w:t>usr</w:t>
-      </w:r>
-      <w:proofErr w:type="spellEnd"/>
-      <w:r>
-        <w:rPr>
-          <w:lang w:val="en-US"/>
-        </w:rPr>
-        <w:t>/local/bin/docker-compose</w:t>
-      </w:r>
-    </w:p>
-    <w:p>
-      <w:r>
-        <w:rPr>
-          <w:lang w:val="en-US"/>
-        </w:rPr>
-        <w:tab/>
-      </w:r>
-      <w:r>
-        <w:t>- Clonar projeto dentro da instância:</w:t>
-      </w:r>
-    </w:p>
-    <w:p>
-      <w:pPr>
-        <w:ind w:left="708" w:firstLine="708"/>
-        <w:rPr>
-          <w:lang w:val="en-US"/>
-        </w:rPr>
-      </w:pPr>
-      <w:r>
-        <w:rPr>
-          <w:lang w:val="en-US"/>
-        </w:rPr>
-        <w:t>“</w:t>
-      </w:r>
-      <w:proofErr w:type="gramStart"/>
-      <w:r>
-        <w:rPr>
-          <w:lang w:val="en-US"/>
-        </w:rPr>
-        <w:t>git</w:t>
-      </w:r>
-      <w:proofErr w:type="gramEnd"/>
-      <w:r>
-        <w:rPr>
-          <w:lang w:val="en-US"/>
-        </w:rPr>
-        <w:t xml:space="preserve"> clone --recurse-submodules https://github.com/guualonso/chamado-pro.git”</w:t>
+        <w:t>“git clone --recurse-submodules https://github.com/guualonso/chamado-pro.git”</w:t>
       </w:r>
     </w:p>
     <w:p>
@@ -5377,7 +5129,6 @@
         <w:ind w:left="708"/>
       </w:pPr>
       <w:r>
-        <w:lastRenderedPageBreak/>
         <w:t>- Teste de performance e latência.</w:t>
       </w:r>
     </w:p>
@@ -5392,6 +5143,7 @@
       </w:pPr>
       <w:bookmarkStart w:id="13" w:name="_Toc487620803"/>
       <w:r>
+        <w:lastRenderedPageBreak/>
         <w:t>Treinamento e suporte</w:t>
       </w:r>
       <w:bookmarkEnd w:id="13"/>
@@ -6260,7 +6012,7 @@
               <v:shape id="_x0000_i1025" type="#_x0000_t75" style="width:61.5pt;height:34.5pt">
                 <v:imagedata r:id="rId1" o:title=""/>
               </v:shape>
-              <o:OLEObject Type="Embed" ProgID="Word.Picture.8" ShapeID="_x0000_i1025" DrawAspect="Content" ObjectID="_1825742211" r:id="rId2"/>
+              <o:OLEObject Type="Embed" ProgID="Word.Picture.8" ShapeID="_x0000_i1025" DrawAspect="Content" ObjectID="_1826695017" r:id="rId2"/>
             </w:object>
           </w:r>
         </w:p>
@@ -9353,8 +9105,10 @@
   <w:rsids>
     <w:rsidRoot w:val="0031272D"/>
     <w:rsid w:val="00255B8E"/>
+    <w:rsid w:val="00265CF8"/>
     <w:rsid w:val="0031272D"/>
     <w:rsid w:val="00503A91"/>
+    <w:rsid w:val="00CB0B60"/>
     <w:rsid w:val="00EF3FE1"/>
     <w:rsid w:val="00F261B2"/>
     <w:rsid w:val="00FB7A3D"/>

</xml_diff>